<commit_message>
Add GitOps pipeline validation screenshots
</commit_message>
<xml_diff>
--- a/Successful GitOps CICD workflow deployment using Helm and ArgoCD.docx
+++ b/Successful GitOps CICD workflow deployment using Helm and ArgoCD.docx
@@ -396,6 +396,253 @@
         </w:drawing>
       </w:r>
     </w:p>
+    <w:p>
+      <w:r>
+        <w:drawing>
+          <wp:inline distT="0" distB="0" distL="0" distR="0" wp14:anchorId="38C9F79C" wp14:editId="26F64F54">
+            <wp:extent cx="5943600" cy="879475"/>
+            <wp:effectExtent l="0" t="0" r="0" b="0"/>
+            <wp:docPr id="739617756" name="Picture 1"/>
+            <wp:cNvGraphicFramePr>
+              <a:graphicFrameLocks xmlns:a="http://schemas.openxmlformats.org/drawingml/2006/main" noChangeAspect="1"/>
+            </wp:cNvGraphicFramePr>
+            <a:graphic xmlns:a="http://schemas.openxmlformats.org/drawingml/2006/main">
+              <a:graphicData uri="http://schemas.openxmlformats.org/drawingml/2006/picture">
+                <pic:pic xmlns:pic="http://schemas.openxmlformats.org/drawingml/2006/picture">
+                  <pic:nvPicPr>
+                    <pic:cNvPr id="739617756" name=""/>
+                    <pic:cNvPicPr/>
+                  </pic:nvPicPr>
+                  <pic:blipFill>
+                    <a:blip r:embed="rId12"/>
+                    <a:stretch>
+                      <a:fillRect/>
+                    </a:stretch>
+                  </pic:blipFill>
+                  <pic:spPr>
+                    <a:xfrm>
+                      <a:off x="0" y="0"/>
+                      <a:ext cx="5943600" cy="879475"/>
+                    </a:xfrm>
+                    <a:prstGeom prst="rect">
+                      <a:avLst/>
+                    </a:prstGeom>
+                  </pic:spPr>
+                </pic:pic>
+              </a:graphicData>
+            </a:graphic>
+          </wp:inline>
+        </w:drawing>
+      </w:r>
+    </w:p>
+    <w:p>
+      <w:r>
+        <w:t>Grafana Dashboard:</w:t>
+      </w:r>
+    </w:p>
+    <w:p>
+      <w:r>
+        <w:drawing>
+          <wp:inline distT="0" distB="0" distL="0" distR="0" wp14:anchorId="4C0175E3" wp14:editId="7D7C6DD0">
+            <wp:extent cx="5943600" cy="2098675"/>
+            <wp:effectExtent l="0" t="0" r="0" b="0"/>
+            <wp:docPr id="551778357" name="Picture 1"/>
+            <wp:cNvGraphicFramePr>
+              <a:graphicFrameLocks xmlns:a="http://schemas.openxmlformats.org/drawingml/2006/main" noChangeAspect="1"/>
+            </wp:cNvGraphicFramePr>
+            <a:graphic xmlns:a="http://schemas.openxmlformats.org/drawingml/2006/main">
+              <a:graphicData uri="http://schemas.openxmlformats.org/drawingml/2006/picture">
+                <pic:pic xmlns:pic="http://schemas.openxmlformats.org/drawingml/2006/picture">
+                  <pic:nvPicPr>
+                    <pic:cNvPr id="551778357" name=""/>
+                    <pic:cNvPicPr/>
+                  </pic:nvPicPr>
+                  <pic:blipFill>
+                    <a:blip r:embed="rId13"/>
+                    <a:stretch>
+                      <a:fillRect/>
+                    </a:stretch>
+                  </pic:blipFill>
+                  <pic:spPr>
+                    <a:xfrm>
+                      <a:off x="0" y="0"/>
+                      <a:ext cx="5943600" cy="2098675"/>
+                    </a:xfrm>
+                    <a:prstGeom prst="rect">
+                      <a:avLst/>
+                    </a:prstGeom>
+                  </pic:spPr>
+                </pic:pic>
+              </a:graphicData>
+            </a:graphic>
+          </wp:inline>
+        </w:drawing>
+      </w:r>
+    </w:p>
+    <w:p>
+      <w:r>
+        <w:lastRenderedPageBreak/>
+        <w:drawing>
+          <wp:inline distT="0" distB="0" distL="0" distR="0" wp14:anchorId="33101A09" wp14:editId="7E518EAB">
+            <wp:extent cx="5943600" cy="2301875"/>
+            <wp:effectExtent l="0" t="0" r="0" b="3175"/>
+            <wp:docPr id="129599097" name="Picture 1"/>
+            <wp:cNvGraphicFramePr>
+              <a:graphicFrameLocks xmlns:a="http://schemas.openxmlformats.org/drawingml/2006/main" noChangeAspect="1"/>
+            </wp:cNvGraphicFramePr>
+            <a:graphic xmlns:a="http://schemas.openxmlformats.org/drawingml/2006/main">
+              <a:graphicData uri="http://schemas.openxmlformats.org/drawingml/2006/picture">
+                <pic:pic xmlns:pic="http://schemas.openxmlformats.org/drawingml/2006/picture">
+                  <pic:nvPicPr>
+                    <pic:cNvPr id="129599097" name=""/>
+                    <pic:cNvPicPr/>
+                  </pic:nvPicPr>
+                  <pic:blipFill>
+                    <a:blip r:embed="rId14"/>
+                    <a:stretch>
+                      <a:fillRect/>
+                    </a:stretch>
+                  </pic:blipFill>
+                  <pic:spPr>
+                    <a:xfrm>
+                      <a:off x="0" y="0"/>
+                      <a:ext cx="5943600" cy="2301875"/>
+                    </a:xfrm>
+                    <a:prstGeom prst="rect">
+                      <a:avLst/>
+                    </a:prstGeom>
+                  </pic:spPr>
+                </pic:pic>
+              </a:graphicData>
+            </a:graphic>
+          </wp:inline>
+        </w:drawing>
+      </w:r>
+    </w:p>
+    <w:p/>
+    <w:p>
+      <w:r>
+        <w:t>App access validations:</w:t>
+      </w:r>
+    </w:p>
+    <w:p>
+      <w:r>
+        <w:lastRenderedPageBreak/>
+        <w:drawing>
+          <wp:inline distT="0" distB="0" distL="0" distR="0" wp14:anchorId="4C1444F1" wp14:editId="39EF8B88">
+            <wp:extent cx="5943600" cy="3740785"/>
+            <wp:effectExtent l="0" t="0" r="0" b="0"/>
+            <wp:docPr id="194410213" name="Picture 1"/>
+            <wp:cNvGraphicFramePr>
+              <a:graphicFrameLocks xmlns:a="http://schemas.openxmlformats.org/drawingml/2006/main" noChangeAspect="1"/>
+            </wp:cNvGraphicFramePr>
+            <a:graphic xmlns:a="http://schemas.openxmlformats.org/drawingml/2006/main">
+              <a:graphicData uri="http://schemas.openxmlformats.org/drawingml/2006/picture">
+                <pic:pic xmlns:pic="http://schemas.openxmlformats.org/drawingml/2006/picture">
+                  <pic:nvPicPr>
+                    <pic:cNvPr id="194410213" name=""/>
+                    <pic:cNvPicPr/>
+                  </pic:nvPicPr>
+                  <pic:blipFill>
+                    <a:blip r:embed="rId15"/>
+                    <a:stretch>
+                      <a:fillRect/>
+                    </a:stretch>
+                  </pic:blipFill>
+                  <pic:spPr>
+                    <a:xfrm>
+                      <a:off x="0" y="0"/>
+                      <a:ext cx="5943600" cy="3740785"/>
+                    </a:xfrm>
+                    <a:prstGeom prst="rect">
+                      <a:avLst/>
+                    </a:prstGeom>
+                  </pic:spPr>
+                </pic:pic>
+              </a:graphicData>
+            </a:graphic>
+          </wp:inline>
+        </w:drawing>
+      </w:r>
+      <w:r>
+        <w:drawing>
+          <wp:inline distT="0" distB="0" distL="0" distR="0" wp14:anchorId="32245D29" wp14:editId="46E260E8">
+            <wp:extent cx="5943600" cy="2199005"/>
+            <wp:effectExtent l="0" t="0" r="0" b="0"/>
+            <wp:docPr id="119013158" name="Picture 1"/>
+            <wp:cNvGraphicFramePr>
+              <a:graphicFrameLocks xmlns:a="http://schemas.openxmlformats.org/drawingml/2006/main" noChangeAspect="1"/>
+            </wp:cNvGraphicFramePr>
+            <a:graphic xmlns:a="http://schemas.openxmlformats.org/drawingml/2006/main">
+              <a:graphicData uri="http://schemas.openxmlformats.org/drawingml/2006/picture">
+                <pic:pic xmlns:pic="http://schemas.openxmlformats.org/drawingml/2006/picture">
+                  <pic:nvPicPr>
+                    <pic:cNvPr id="119013158" name=""/>
+                    <pic:cNvPicPr/>
+                  </pic:nvPicPr>
+                  <pic:blipFill>
+                    <a:blip r:embed="rId16"/>
+                    <a:stretch>
+                      <a:fillRect/>
+                    </a:stretch>
+                  </pic:blipFill>
+                  <pic:spPr>
+                    <a:xfrm>
+                      <a:off x="0" y="0"/>
+                      <a:ext cx="5943600" cy="2199005"/>
+                    </a:xfrm>
+                    <a:prstGeom prst="rect">
+                      <a:avLst/>
+                    </a:prstGeom>
+                  </pic:spPr>
+                </pic:pic>
+              </a:graphicData>
+            </a:graphic>
+          </wp:inline>
+        </w:drawing>
+      </w:r>
+    </w:p>
+    <w:p>
+      <w:r>
+        <w:lastRenderedPageBreak/>
+        <w:drawing>
+          <wp:inline distT="0" distB="0" distL="0" distR="0" wp14:anchorId="6A50B626" wp14:editId="5B4DC534">
+            <wp:extent cx="5943600" cy="3213735"/>
+            <wp:effectExtent l="0" t="0" r="0" b="5715"/>
+            <wp:docPr id="1893741546" name="Picture 1"/>
+            <wp:cNvGraphicFramePr>
+              <a:graphicFrameLocks xmlns:a="http://schemas.openxmlformats.org/drawingml/2006/main" noChangeAspect="1"/>
+            </wp:cNvGraphicFramePr>
+            <a:graphic xmlns:a="http://schemas.openxmlformats.org/drawingml/2006/main">
+              <a:graphicData uri="http://schemas.openxmlformats.org/drawingml/2006/picture">
+                <pic:pic xmlns:pic="http://schemas.openxmlformats.org/drawingml/2006/picture">
+                  <pic:nvPicPr>
+                    <pic:cNvPr id="1893741546" name=""/>
+                    <pic:cNvPicPr/>
+                  </pic:nvPicPr>
+                  <pic:blipFill>
+                    <a:blip r:embed="rId17"/>
+                    <a:stretch>
+                      <a:fillRect/>
+                    </a:stretch>
+                  </pic:blipFill>
+                  <pic:spPr>
+                    <a:xfrm>
+                      <a:off x="0" y="0"/>
+                      <a:ext cx="5943600" cy="3213735"/>
+                    </a:xfrm>
+                    <a:prstGeom prst="rect">
+                      <a:avLst/>
+                    </a:prstGeom>
+                  </pic:spPr>
+                </pic:pic>
+              </a:graphicData>
+            </a:graphic>
+          </wp:inline>
+        </w:drawing>
+      </w:r>
+    </w:p>
+    <w:p/>
     <w:p/>
     <w:p/>
     <w:p/>

</xml_diff>